<commit_message>
Redesign portfolio: dark terminal theme, multi-page layout
- Split single page into Home, About, Experience, Projects and Contact pages
- New dark minimal theme with subtle Kali-terminal accents, fully responsive
- Add AskPES, DevWrapped and InvoiceFlow projects from GitHub
- Update contact email to achyutatamweb@gmail.com and GitHub links to ollivanter
- Update CV (PDF + DOCX) with new email and GitHub link

Co-Authored-By: Claude Opus 5.5 <noreply@anthropic.com>
</commit_message>
<xml_diff>
--- a/Modern_Simple_ATS_Friendly_LateX_CV.docx
+++ b/Modern_Simple_ATS_Friendly_LateX_CV.docx
@@ -116,153 +116,180 @@
             <w:position w:val="1"/>
             <w:sz w:val="22"/>
           </w:rPr>
-          <w:t>achyuta.tamraparni6664@gmail.com</w:t>
+          <w:t>achyutatamweb@gmail.com</w:t>
           <w:tab/>
         </w:r>
-        <w:r>
-          <w:rPr>
-            <w:sz w:val="22"/>
-          </w:rPr>
-          <w:drawing>
-            <wp:inline distT="0" distB="0" distL="0" distR="0">
-              <wp:extent cx="123825" cy="123825"/>
-              <wp:effectExtent l="0" t="0" r="0" b="0"/>
-              <wp:docPr id="2" name="Image 2"/>
-              <wp:cNvGraphicFramePr>
-                <a:graphicFrameLocks/>
-              </wp:cNvGraphicFramePr>
-              <a:graphic>
-                <a:graphicData uri="http://schemas.openxmlformats.org/drawingml/2006/picture">
-                  <pic:pic>
-                    <pic:nvPicPr>
-                      <pic:cNvPr id="2" name="Image 2"/>
-                      <pic:cNvPicPr/>
-                    </pic:nvPicPr>
-                    <pic:blipFill>
-                      <a:blip r:embed="rId7" cstate="print"/>
-                      <a:stretch>
-                        <a:fillRect/>
-                      </a:stretch>
-                    </pic:blipFill>
-                    <pic:spPr>
-                      <a:xfrm>
-                        <a:off x="0" y="0"/>
-                        <a:ext cx="123825" cy="123825"/>
-                      </a:xfrm>
-                      <a:prstGeom prst="rect">
-                        <a:avLst/>
-                      </a:prstGeom>
-                    </pic:spPr>
-                  </pic:pic>
-                </a:graphicData>
-              </a:graphic>
-            </wp:inline>
-          </w:drawing>
-        </w:r>
-        <w:r>
-          <w:rPr>
-            <w:sz w:val="22"/>
-          </w:rPr>
-        </w:r>
-        <w:r>
-          <w:rPr>
-            <w:rFonts w:ascii="Times New Roman"/>
-            <w:spacing w:val="12"/>
-            <w:position w:val="1"/>
-            <w:sz w:val="22"/>
-          </w:rPr>
-          <w:t> </w:t>
-        </w:r>
-        <w:hyperlink r:id="rId8">
-          <w:r>
-            <w:rPr>
-              <w:spacing w:val="-4"/>
-              <w:position w:val="1"/>
-              <w:sz w:val="22"/>
-            </w:rPr>
-            <w:t>linkedin.com/in/achyuta-</w:t>
-          </w:r>
-          <w:r>
-            <w:rPr>
-              <w:spacing w:val="-4"/>
-              <w:position w:val="1"/>
-              <w:sz w:val="22"/>
-            </w:rPr>
-            <w:t>tamraparni</w:t>
-          </w:r>
-        </w:hyperlink>
+      </w:hyperlink>
+      <w:r>
+        <w:rPr>
+          <w:sz w:val="22"/>
+        </w:rPr>
+        <w:drawing>
+          <wp:inline distT="0" distB="0" distL="0" distR="0">
+            <wp:extent cx="123825" cy="123825"/>
+            <wp:effectExtent l="0" t="0" r="0" b="0"/>
+            <wp:docPr id="2" name="Image 2"/>
+            <wp:cNvGraphicFramePr>
+              <a:graphicFrameLocks/>
+            </wp:cNvGraphicFramePr>
+            <a:graphic>
+              <a:graphicData uri="http://schemas.openxmlformats.org/drawingml/2006/picture">
+                <pic:pic>
+                  <pic:nvPicPr>
+                    <pic:cNvPr id="2" name="Image 2"/>
+                    <pic:cNvPicPr/>
+                  </pic:nvPicPr>
+                  <pic:blipFill>
+                    <a:blip r:embed="rId7" cstate="print"/>
+                    <a:stretch>
+                      <a:fillRect/>
+                    </a:stretch>
+                  </pic:blipFill>
+                  <pic:spPr>
+                    <a:xfrm>
+                      <a:off x="0" y="0"/>
+                      <a:ext cx="123825" cy="123825"/>
+                    </a:xfrm>
+                    <a:prstGeom prst="rect">
+                      <a:avLst/>
+                    </a:prstGeom>
+                  </pic:spPr>
+                </pic:pic>
+              </a:graphicData>
+            </a:graphic>
+          </wp:inline>
+        </w:drawing>
+      </w:r>
+      <w:r>
+        <w:rPr>
+          <w:sz w:val="22"/>
+        </w:rPr>
+      </w:r>
+      <w:r>
+        <w:rPr>
+          <w:rFonts w:ascii="Times New Roman"/>
+          <w:spacing w:val="12"/>
+          <w:position w:val="1"/>
+          <w:sz w:val="22"/>
+        </w:rPr>
+        <w:t> </w:t>
+      </w:r>
+      <w:hyperlink r:id="rId8">
         <w:r>
           <w:rPr>
             <w:spacing w:val="-4"/>
             <w:position w:val="1"/>
             <w:sz w:val="22"/>
           </w:rPr>
-          <w:t> </w:t>
+          <w:t>linkedin.com/in/achyuta-</w:t>
         </w:r>
         <w:r>
           <w:rPr>
-            <w:spacing w:val="-1"/>
-            <w:position w:val="-2"/>
+            <w:spacing w:val="-4"/>
+            <w:position w:val="1"/>
             <w:sz w:val="22"/>
           </w:rPr>
-          <w:drawing>
-            <wp:inline distT="0" distB="0" distL="0" distR="0">
-              <wp:extent cx="104775" cy="142875"/>
-              <wp:effectExtent l="0" t="0" r="0" b="0"/>
-              <wp:docPr id="3" name="Image 3"/>
-              <wp:cNvGraphicFramePr>
-                <a:graphicFrameLocks/>
-              </wp:cNvGraphicFramePr>
-              <a:graphic>
-                <a:graphicData uri="http://schemas.openxmlformats.org/drawingml/2006/picture">
-                  <pic:pic>
-                    <pic:nvPicPr>
-                      <pic:cNvPr id="3" name="Image 3"/>
-                      <pic:cNvPicPr/>
-                    </pic:nvPicPr>
-                    <pic:blipFill>
-                      <a:blip r:embed="rId9" cstate="print"/>
-                      <a:stretch>
-                        <a:fillRect/>
-                      </a:stretch>
-                    </pic:blipFill>
-                    <pic:spPr>
-                      <a:xfrm>
-                        <a:off x="0" y="0"/>
-                        <a:ext cx="104775" cy="142875"/>
-                      </a:xfrm>
-                      <a:prstGeom prst="rect">
-                        <a:avLst/>
-                      </a:prstGeom>
-                    </pic:spPr>
-                  </pic:pic>
-                </a:graphicData>
-              </a:graphic>
-            </wp:inline>
-          </w:drawing>
+          <w:t>tamraparni</w:t>
         </w:r>
+      </w:hyperlink>
+      <w:r>
+        <w:rPr>
+          <w:rFonts w:ascii="Times New Roman"/>
+          <w:spacing w:val="40"/>
+          <w:position w:val="1"/>
+          <w:sz w:val="22"/>
+        </w:rPr>
+        <w:t/>
+      </w:r>
+      <w:r>
+        <w:br/>
+      </w:r>
+      <w:hyperlink r:id="rId11">
         <w:r>
           <w:rPr>
-            <w:spacing w:val="-1"/>
-            <w:position w:val="-2"/>
+            <w:position w:val="1"/>
             <w:sz w:val="22"/>
           </w:rPr>
-        </w:r>
-        <w:r>
-          <w:rPr>
-            <w:rFonts w:ascii="Times New Roman"/>
-            <w:spacing w:val="40"/>
-            <w:sz w:val="22"/>
-          </w:rPr>
-          <w:t> </w:t>
-        </w:r>
-        <w:r>
-          <w:rPr>
-            <w:sz w:val="22"/>
-          </w:rPr>
-          <w:t>Bangalore, India</w:t>
+          <w:t>github.com/ollivanter</w:t>
         </w:r>
       </w:hyperlink>
+      <w:r>
+        <w:rPr>
+          <w:sz w:val="22"/>
+        </w:rPr>
+        <w:t xml:space="preserve">      </w:t>
+      </w:r>
+      <w:r>
+        <w:rPr>
+          <w:spacing w:val="-4"/>
+          <w:position w:val="1"/>
+          <w:sz w:val="22"/>
+        </w:rPr>
+        <w:t> </w:t>
+      </w:r>
+      <w:r>
+        <w:rPr>
+          <w:spacing w:val="-1"/>
+          <w:position w:val="-2"/>
+          <w:sz w:val="22"/>
+        </w:rPr>
+        <w:drawing>
+          <wp:inline distT="0" distB="0" distL="0" distR="0">
+            <wp:extent cx="104775" cy="142875"/>
+            <wp:effectExtent l="0" t="0" r="0" b="0"/>
+            <wp:docPr id="3" name="Image 3"/>
+            <wp:cNvGraphicFramePr>
+              <a:graphicFrameLocks/>
+            </wp:cNvGraphicFramePr>
+            <a:graphic>
+              <a:graphicData uri="http://schemas.openxmlformats.org/drawingml/2006/picture">
+                <pic:pic>
+                  <pic:nvPicPr>
+                    <pic:cNvPr id="3" name="Image 3"/>
+                    <pic:cNvPicPr/>
+                  </pic:nvPicPr>
+                  <pic:blipFill>
+                    <a:blip r:embed="rId9" cstate="print"/>
+                    <a:stretch>
+                      <a:fillRect/>
+                    </a:stretch>
+                  </pic:blipFill>
+                  <pic:spPr>
+                    <a:xfrm>
+                      <a:off x="0" y="0"/>
+                      <a:ext cx="104775" cy="142875"/>
+                    </a:xfrm>
+                    <a:prstGeom prst="rect">
+                      <a:avLst/>
+                    </a:prstGeom>
+                  </pic:spPr>
+                </pic:pic>
+              </a:graphicData>
+            </a:graphic>
+          </wp:inline>
+        </w:drawing>
+      </w:r>
+      <w:r>
+        <w:rPr>
+          <w:spacing w:val="-1"/>
+          <w:position w:val="-2"/>
+          <w:sz w:val="22"/>
+        </w:rPr>
+      </w:r>
+      <w:r>
+        <w:rPr>
+          <w:rFonts w:ascii="Times New Roman"/>
+          <w:spacing w:val="40"/>
+          <w:sz w:val="22"/>
+        </w:rPr>
+        <w:t> </w:t>
+      </w:r>
+      <w:r>
+        <w:rPr>
+          <w:sz w:val="22"/>
+        </w:rPr>
+        <w:t>Bangalore, India</w:t>
+      </w:r>
     </w:p>
     <w:p>
       <w:pPr>

</xml_diff>

<commit_message>
Update LinkedIn URL to /in/s-achyuta-tamraparni across site and CV
Co-Authored-By: Claude Opus 5.5 <noreply@anthropic.com>
Claude-Session: https://claude.ai/code/session_012aAiCuXsWsVkybzAXowvax
</commit_message>
<xml_diff>
--- a/Modern_Simple_ATS_Friendly_LateX_CV.docx
+++ b/Modern_Simple_ATS_Friendly_LateX_CV.docx
@@ -50,7 +50,7 @@
           <w:tab w:pos="5074" w:val="left" w:leader="none"/>
         </w:tabs>
         <w:spacing w:line="367" w:lineRule="auto" w:before="242"/>
-        <w:ind w:left="371" w:right="440" w:firstLine="0"/>
+        <w:ind w:left="0" w:right="0" w:firstLine="0"/>
         <w:jc w:val="center"/>
         <w:rPr>
           <w:sz w:val="22"/>
@@ -181,7 +181,7 @@
             <w:position w:val="1"/>
             <w:sz w:val="22"/>
           </w:rPr>
-          <w:t>linkedin.com/in/achyuta-</w:t>
+          <w:t>linkedin.com/in/s-achyuta-</w:t>
         </w:r>
         <w:r>
           <w:rPr>

</xml_diff>

<commit_message>
Move AskPES to the end of the CV project list
Co-Authored-By: Claude Opus 5.5 <noreply@anthropic.com>
Claude-Session: https://claude.ai/code/session_012aAiCuXsWsVkybzAXowvax
</commit_message>
<xml_diff>
--- a/Modern_Simple_ATS_Friendly_LateX_CV.docx
+++ b/Modern_Simple_ATS_Friendly_LateX_CV.docx
@@ -166,90 +166,12 @@
         <w:rPr>
           <w:b/>
         </w:rPr>
-        <w:t>AskPES - Anonymous Q&amp;A Platform for PES University</w:t>
+        <w:t>DevWrapped - GitHub Analytics Dashboard</w:t>
       </w:r>
       <w:r>
         <w:t xml:space="preserve"> | </w:t>
       </w:r>
       <w:hyperlink r:id="rId12">
-        <w:r>
-          <w:rPr/>
-          <w:t xml:space="preserve">github.com/ollivanter/AskPES</w:t>
-        </w:r>
-      </w:hyperlink>
-      <w:r>
-        <w:t xml:space="preserve"> | </w:t>
-      </w:r>
-      <w:hyperlink r:id="rId13">
-        <w:r>
-          <w:rPr/>
-          <w:t xml:space="preserve">ask-pes.vercel.app</w:t>
-        </w:r>
-      </w:hyperlink>
-    </w:p>
-    <w:p>
-      <w:pPr>
-        <w:keepNext/>
-        <w:spacing w:before="0"/>
-      </w:pPr>
-      <w:r>
-        <w:rPr>
-          <w:i/>
-        </w:rPr>
-        <w:t>Technologies:</w:t>
-      </w:r>
-      <w:r>
-        <w:t xml:space="preserve"> Next.js (App Router), TypeScript, PostgreSQL (Neon), Drizzle ORM, Elasticsearch, Tailwind CSS, Vercel</w:t>
-      </w:r>
-    </w:p>
-    <w:p>
-      <w:pPr>
-        <w:ind w:left="240" w:hanging="180"/>
-      </w:pPr>
-      <w:r>
-        <w:t xml:space="preserve">•  </w:t>
-      </w:r>
-      <w:r>
-        <w:t>Built and deployed a full-stack Q&amp;A platform with department-wise feeds, tagging (up to 5 tags per question), one-vote-per-user voting, and asker-accepted answers.</w:t>
-      </w:r>
-    </w:p>
-    <w:p>
-      <w:pPr>
-        <w:ind w:left="240" w:hanging="180"/>
-      </w:pPr>
-      <w:r>
-        <w:t xml:space="preserve">•  </w:t>
-      </w:r>
-      <w:r>
-        <w:t>Implemented hybrid search combining BM25 keyword and semantic search, merged with Reciprocal Rank Fusion and re-ranked by a cross-encoder; added a PostgreSQL full-text fallback.</w:t>
-      </w:r>
-    </w:p>
-    <w:p>
-      <w:pPr>
-        <w:ind w:left="240" w:hanging="180"/>
-      </w:pPr>
-      <w:r>
-        <w:t xml:space="preserve">•  </w:t>
-      </w:r>
-      <w:r>
-        <w:t>Designed an anonymity model using deterministic pseudonyms hashed from post IDs, with sign-up restricted to university email domains and emails never displayed publicly.</w:t>
-      </w:r>
-    </w:p>
-    <w:p>
-      <w:pPr>
-        <w:keepNext/>
-        <w:spacing w:before="80"/>
-      </w:pPr>
-      <w:r>
-        <w:rPr>
-          <w:b/>
-        </w:rPr>
-        <w:t>DevWrapped - GitHub Analytics Dashboard</w:t>
-      </w:r>
-      <w:r>
-        <w:t xml:space="preserve"> | </w:t>
-      </w:r>
-      <w:hyperlink r:id="rId14">
         <w:r>
           <w:rPr/>
           <w:t xml:space="preserve">github.com/ollivanter/DevWrapped</w:t>
@@ -318,7 +240,7 @@
       <w:r>
         <w:t xml:space="preserve"> | </w:t>
       </w:r>
-      <w:hyperlink r:id="rId15">
+      <w:hyperlink r:id="rId13">
         <w:r>
           <w:rPr/>
           <w:t xml:space="preserve">github.com/ollivanter/life-automations</w:t>
@@ -387,7 +309,7 @@
       <w:r>
         <w:t xml:space="preserve"> | </w:t>
       </w:r>
-      <w:hyperlink r:id="rId16">
+      <w:hyperlink r:id="rId14">
         <w:r>
           <w:rPr/>
           <w:t xml:space="preserve">github.com/ollivanter/InvoiceFlow</w:t>
@@ -429,6 +351,84 @@
       </w:r>
       <w:r>
         <w:t>Implemented OTP-based email verification, company branding with logo upload, and a master item catalog with fuzzy-search autocomplete.</w:t>
+      </w:r>
+    </w:p>
+    <w:p>
+      <w:pPr>
+        <w:keepNext/>
+        <w:spacing w:before="80"/>
+      </w:pPr>
+      <w:r>
+        <w:rPr>
+          <w:b/>
+        </w:rPr>
+        <w:t>AskPES - Anonymous Q&amp;A Platform for PES University</w:t>
+      </w:r>
+      <w:r>
+        <w:t xml:space="preserve"> | </w:t>
+      </w:r>
+      <w:hyperlink r:id="rId15">
+        <w:r>
+          <w:rPr/>
+          <w:t xml:space="preserve">github.com/ollivanter/AskPES</w:t>
+        </w:r>
+      </w:hyperlink>
+      <w:r>
+        <w:t xml:space="preserve"> | </w:t>
+      </w:r>
+      <w:hyperlink r:id="rId16">
+        <w:r>
+          <w:rPr/>
+          <w:t xml:space="preserve">ask-pes.vercel.app</w:t>
+        </w:r>
+      </w:hyperlink>
+    </w:p>
+    <w:p>
+      <w:pPr>
+        <w:keepNext/>
+        <w:spacing w:before="0"/>
+      </w:pPr>
+      <w:r>
+        <w:rPr>
+          <w:i/>
+        </w:rPr>
+        <w:t>Technologies:</w:t>
+      </w:r>
+      <w:r>
+        <w:t xml:space="preserve"> Next.js (App Router), TypeScript, PostgreSQL (Neon), Drizzle ORM, Elasticsearch, Tailwind CSS, Vercel</w:t>
+      </w:r>
+    </w:p>
+    <w:p>
+      <w:pPr>
+        <w:ind w:left="240" w:hanging="180"/>
+      </w:pPr>
+      <w:r>
+        <w:t xml:space="preserve">•  </w:t>
+      </w:r>
+      <w:r>
+        <w:t>Built and deployed a full-stack Q&amp;A platform with department-wise feeds, tagging (up to 5 tags per question), one-vote-per-user voting, and asker-accepted answers.</w:t>
+      </w:r>
+    </w:p>
+    <w:p>
+      <w:pPr>
+        <w:ind w:left="240" w:hanging="180"/>
+      </w:pPr>
+      <w:r>
+        <w:t xml:space="preserve">•  </w:t>
+      </w:r>
+      <w:r>
+        <w:t>Implemented hybrid search combining BM25 keyword and semantic search, merged with Reciprocal Rank Fusion and re-ranked by a cross-encoder; added a PostgreSQL full-text fallback.</w:t>
+      </w:r>
+    </w:p>
+    <w:p>
+      <w:pPr>
+        <w:ind w:left="240" w:hanging="180"/>
+      </w:pPr>
+      <w:r>
+        <w:t xml:space="preserve">•  </w:t>
+      </w:r>
+      <w:r>
+        <w:t>Designed an anonymity model using deterministic pseudonyms hashed from post IDs, with sign-up restricted to university email domains and emails never displayed publicly.</w:t>
       </w:r>
     </w:p>
     <w:p>

</xml_diff>